<commit_message>
feat: Update PPTX and DOCX templates to include additional attributes for improved layout and styling
</commit_message>
<xml_diff>
--- a/public/sample_uploads/portfolio_report_templates/word_placeholder_template.docx
+++ b/public/sample_uploads/portfolio_report_templates/word_placeholder_template.docx
@@ -426,16 +426,28 @@
       </w:rPr>
       <w:t xml:space="preserve">Page </w:t>
     </w:r>
-    <w:fldChar w:fldCharType="begin"/>
-    <w:instrText>PAGE</w:instrText>
-    <w:fldChar w:fldCharType="end"/>
+    <w:r>
+      <w:fldChar w:fldCharType="begin"/>
+    </w:r>
+    <w:r>
+      <w:instrText xml:space="preserve"> PAGE </w:instrText>
+    </w:r>
+    <w:r>
+      <w:fldChar w:fldCharType="separate"/>
+    </w:r>
+    <w:r>
+      <w:t>1</w:t>
+    </w:r>
+    <w:r>
+      <w:fldChar w:fldCharType="end"/>
+    </w:r>
     <w:r>
       <w:rPr>
         <w:color w:val="94A3B8"/>
         <w:sz w:val="16"/>
         <w:szCs w:val="16"/>
       </w:rPr>
-      <w:t xml:space="preserve">  |  Generated: 29 May 2026  |  CapHive</w:t>
+      <w:t xml:space="preserve">  |  Generated: 12 Jun 2026  |  CapHive</w:t>
     </w:r>
   </w:p>
 </w:ftr>

</xml_diff>